<commit_message>
Expand anticipated Q&A in English meeting script
Co-Authored-By: Claude Opus 5.5 <noreply@anthropic.com>
Claude-Session: https://claude.ai/code/session_01V8Ap36NPRUEfPv1AkqDaCY
</commit_message>
<xml_diff>
--- a/deliverables/SAK_FY2026_Interim_Closing_Script_EN.docx
+++ b/deliverables/SAK_FY2026_Interim_Closing_Script_EN.docx
@@ -1615,7 +1615,735 @@
     </w:p>
     <w:p>
       <w:pPr>
-        <w:spacing w:after="60" w:before="120"/>
+        <w:spacing w:after="80" w:before="240"/>
+      </w:pPr>
+      <w:r>
+        <w:rPr>
+          <w:rFonts w:ascii="Arial" w:cs="Arial" w:eastAsia="Arial" w:hAnsi="Arial"/>
+          <w:b/>
+          <w:bCs/>
+          <w:color w:val="1F5FBF"/>
+          <w:sz w:val="24"/>
+          <w:szCs w:val="24"/>
+        </w:rPr>
+        <w:t xml:space="preserve">General</w:t>
+      </w:r>
+    </w:p>
+    <w:p>
+      <w:pPr>
+        <w:spacing w:after="40" w:before="100"/>
+      </w:pPr>
+      <w:r>
+        <w:rPr>
+          <w:rFonts w:ascii="Arial" w:cs="Arial" w:eastAsia="Arial" w:hAnsi="Arial"/>
+          <w:b/>
+          <w:bCs/>
+          <w:sz w:val="22"/>
+          <w:szCs w:val="22"/>
+        </w:rPr>
+        <w:t xml:space="preserve">Q. Do we need to change the September interim numbers?</w:t>
+      </w:r>
+    </w:p>
+    <w:p>
+      <w:pPr>
+        <w:spacing w:after="100"/>
+      </w:pPr>
+      <w:r>
+        <w:rPr>
+          <w:rFonts w:ascii="Arial" w:cs="Arial" w:eastAsia="Arial" w:hAnsi="Arial"/>
+          <w:sz w:val="22"/>
+          <w:szCs w:val="22"/>
+        </w:rPr>
+        <w:t xml:space="preserve">A. No. These points are for the year-end financial statements. We’d like you to reflect them by year-end.</w:t>
+      </w:r>
+    </w:p>
+    <w:p>
+      <w:pPr>
+        <w:spacing w:after="40" w:before="100"/>
+      </w:pPr>
+      <w:r>
+        <w:rPr>
+          <w:rFonts w:ascii="Arial" w:cs="Arial" w:eastAsia="Arial" w:hAnsi="Arial"/>
+          <w:b/>
+          <w:bCs/>
+          <w:sz w:val="22"/>
+          <w:szCs w:val="22"/>
+        </w:rPr>
+        <w:t xml:space="preserve">Q. Will any of these points go into a management letter?</w:t>
+      </w:r>
+    </w:p>
+    <w:p>
+      <w:pPr>
+        <w:spacing w:after="100"/>
+      </w:pPr>
+      <w:r>
+        <w:rPr>
+          <w:rFonts w:ascii="Arial" w:cs="Arial" w:eastAsia="Arial" w:hAnsi="Arial"/>
+          <w:sz w:val="22"/>
+          <w:szCs w:val="22"/>
+        </w:rPr>
+        <w:t xml:space="preserve">A. If any control points remain after the year-end audit, we’ll share them in writing. So far, we haven’t found any control exceptions.</w:t>
+      </w:r>
+    </w:p>
+    <w:p>
+      <w:pPr>
+        <w:spacing w:after="40" w:before="100"/>
+      </w:pPr>
+      <w:r>
+        <w:rPr>
+          <w:rFonts w:ascii="Arial" w:cs="Arial" w:eastAsia="Arial" w:hAnsi="Arial"/>
+          <w:b/>
+          <w:bCs/>
+          <w:sz w:val="22"/>
+          <w:szCs w:val="22"/>
+        </w:rPr>
+        <w:t xml:space="preserve">Q. Which items are the most important for year-end?</w:t>
+      </w:r>
+    </w:p>
+    <w:p>
+      <w:pPr>
+        <w:spacing w:after="100"/>
+      </w:pPr>
+      <w:r>
+        <w:rPr>
+          <w:rFonts w:ascii="Arial" w:cs="Arial" w:eastAsia="Arial" w:hAnsi="Arial"/>
+          <w:sz w:val="22"/>
+          <w:szCs w:val="22"/>
+        </w:rPr>
+        <w:t xml:space="preserve">A. Taxotere, the restructuring provision, and the Action share cost. These have the biggest amounts or need the most judgment.</w:t>
+      </w:r>
+    </w:p>
+    <w:p>
+      <w:pPr>
+        <w:spacing w:after="80" w:before="240"/>
+      </w:pPr>
+      <w:r>
+        <w:rPr>
+          <w:rFonts w:ascii="Arial" w:cs="Arial" w:eastAsia="Arial" w:hAnsi="Arial"/>
+          <w:b/>
+          <w:bCs/>
+          <w:color w:val="1F5FBF"/>
+          <w:sz w:val="24"/>
+          <w:szCs w:val="24"/>
+        </w:rPr>
+        <w:t xml:space="preserve">Audit schedule and year-end preparation (Slides 4, 16)</w:t>
+      </w:r>
+    </w:p>
+    <w:p>
+      <w:pPr>
+        <w:spacing w:after="40" w:before="100"/>
+      </w:pPr>
+      <w:r>
+        <w:rPr>
+          <w:rFonts w:ascii="Arial" w:cs="Arial" w:eastAsia="Arial" w:hAnsi="Arial"/>
+          <w:b/>
+          <w:bCs/>
+          <w:sz w:val="22"/>
+          <w:szCs w:val="22"/>
+        </w:rPr>
+        <w:t xml:space="preserve">Q. Can we change the inventory count date?</w:t>
+      </w:r>
+    </w:p>
+    <w:p>
+      <w:pPr>
+        <w:spacing w:after="100"/>
+      </w:pPr>
+      <w:r>
+        <w:rPr>
+          <w:rFonts w:ascii="Arial" w:cs="Arial" w:eastAsia="Arial" w:hAnsi="Arial"/>
+          <w:sz w:val="22"/>
+          <w:szCs w:val="22"/>
+        </w:rPr>
+        <w:t xml:space="preserve">A. Yes, but please tell us as early as possible. If the count is before December 31, we’ll also test the movements from the count date to year-end.</w:t>
+      </w:r>
+    </w:p>
+    <w:p>
+      <w:pPr>
+        <w:spacing w:after="40" w:before="100"/>
+      </w:pPr>
+      <w:r>
+        <w:rPr>
+          <w:rFonts w:ascii="Arial" w:cs="Arial" w:eastAsia="Arial" w:hAnsi="Arial"/>
+          <w:b/>
+          <w:bCs/>
+          <w:sz w:val="22"/>
+          <w:szCs w:val="22"/>
+        </w:rPr>
+        <w:t xml:space="preserve">Q. What do you need for the inventory count?</w:t>
+      </w:r>
+    </w:p>
+    <w:p>
+      <w:pPr>
+        <w:spacing w:after="100"/>
+      </w:pPr>
+      <w:r>
+        <w:rPr>
+          <w:rFonts w:ascii="Arial" w:cs="Arial" w:eastAsia="Arial" w:hAnsi="Arial"/>
+          <w:sz w:val="22"/>
+          <w:szCs w:val="22"/>
+        </w:rPr>
+        <w:t xml:space="preserve">A. The count instructions, the stock listing as of the count date, and the last receiving and shipping documents for cut-off testing.</w:t>
+      </w:r>
+    </w:p>
+    <w:p>
+      <w:pPr>
+        <w:spacing w:after="40" w:before="100"/>
+      </w:pPr>
+      <w:r>
+        <w:rPr>
+          <w:rFonts w:ascii="Arial" w:cs="Arial" w:eastAsia="Arial" w:hAnsi="Arial"/>
+          <w:b/>
+          <w:bCs/>
+          <w:sz w:val="22"/>
+          <w:szCs w:val="22"/>
+        </w:rPr>
+        <w:t xml:space="preserve">Q. What do you need for the confirmations?</w:t>
+      </w:r>
+    </w:p>
+    <w:p>
+      <w:pPr>
+        <w:spacing w:after="100"/>
+      </w:pPr>
+      <w:r>
+        <w:rPr>
+          <w:rFonts w:ascii="Arial" w:cs="Arial" w:eastAsia="Arial" w:hAnsi="Arial"/>
+          <w:sz w:val="22"/>
+          <w:szCs w:val="22"/>
+        </w:rPr>
+        <w:t xml:space="preserve">A. A list of bank accounts, a list of legal counsel, and AR and AP balance listings at December 31 by customer and vendor. We’ll pick our samples from those listings.</w:t>
+      </w:r>
+    </w:p>
+    <w:p>
+      <w:pPr>
+        <w:spacing w:after="40" w:before="100"/>
+      </w:pPr>
+      <w:r>
+        <w:rPr>
+          <w:rFonts w:ascii="Arial" w:cs="Arial" w:eastAsia="Arial" w:hAnsi="Arial"/>
+          <w:b/>
+          <w:bCs/>
+          <w:sz w:val="22"/>
+          <w:szCs w:val="22"/>
+        </w:rPr>
+        <w:t xml:space="preserve">Q. What happens if we can’t provide something by the deadline?</w:t>
+      </w:r>
+    </w:p>
+    <w:p>
+      <w:pPr>
+        <w:spacing w:after="100"/>
+      </w:pPr>
+      <w:r>
+        <w:rPr>
+          <w:rFonts w:ascii="Arial" w:cs="Arial" w:eastAsia="Arial" w:hAnsi="Arial"/>
+          <w:sz w:val="22"/>
+          <w:szCs w:val="22"/>
+        </w:rPr>
+        <w:t xml:space="preserve">A. We’ll do alternative procedures, but that usually takes more time for both sides. So we’d appreciate it if you could keep to the dates on the slide.</w:t>
+      </w:r>
+    </w:p>
+    <w:p>
+      <w:pPr>
+        <w:spacing w:after="80" w:before="240"/>
+      </w:pPr>
+      <w:r>
+        <w:rPr>
+          <w:rFonts w:ascii="Arial" w:cs="Arial" w:eastAsia="Arial" w:hAnsi="Arial"/>
+          <w:b/>
+          <w:bCs/>
+          <w:color w:val="1F5FBF"/>
+          <w:sz w:val="24"/>
+          <w:szCs w:val="24"/>
+        </w:rPr>
+        <w:t xml:space="preserve">Control testing (Slide 6)</w:t>
+      </w:r>
+    </w:p>
+    <w:p>
+      <w:pPr>
+        <w:spacing w:after="40" w:before="100"/>
+      </w:pPr>
+      <w:r>
+        <w:rPr>
+          <w:rFonts w:ascii="Arial" w:cs="Arial" w:eastAsia="Arial" w:hAnsi="Arial"/>
+          <w:b/>
+          <w:bCs/>
+          <w:sz w:val="22"/>
+          <w:szCs w:val="22"/>
+        </w:rPr>
+        <w:t xml:space="preserve">Q. What if a pending control can’t be tested?</w:t>
+      </w:r>
+    </w:p>
+    <w:p>
+      <w:pPr>
+        <w:spacing w:after="100"/>
+      </w:pPr>
+      <w:r>
+        <w:rPr>
+          <w:rFonts w:ascii="Arial" w:cs="Arial" w:eastAsia="Arial" w:hAnsi="Arial"/>
+          <w:sz w:val="22"/>
+          <w:szCs w:val="22"/>
+        </w:rPr>
+        <w:t xml:space="preserve">A. Then we can’t rely on that control, and we’ll do more detailed testing at year-end instead. It doesn’t mean there’s a problem — it just changes our approach.</w:t>
+      </w:r>
+    </w:p>
+    <w:p>
+      <w:pPr>
+        <w:spacing w:after="40" w:before="100"/>
+      </w:pPr>
+      <w:r>
+        <w:rPr>
+          <w:rFonts w:ascii="Arial" w:cs="Arial" w:eastAsia="Arial" w:hAnsi="Arial"/>
+          <w:b/>
+          <w:bCs/>
+          <w:sz w:val="22"/>
+          <w:szCs w:val="22"/>
+        </w:rPr>
+        <w:t xml:space="preserve">Q. What evidence is missing for fixed assets?</w:t>
+      </w:r>
+    </w:p>
+    <w:p>
+      <w:pPr>
+        <w:spacing w:after="100"/>
+      </w:pPr>
+      <w:r>
+        <w:rPr>
+          <w:rFonts w:ascii="Arial" w:cs="Arial" w:eastAsia="Arial" w:hAnsi="Arial"/>
+          <w:sz w:val="22"/>
+          <w:szCs w:val="22"/>
+        </w:rPr>
+        <w:t xml:space="preserve">A. For a sample of acquisitions, we need the purchase request, the approval, and the asset registration record.</w:t>
+      </w:r>
+    </w:p>
+    <w:p>
+      <w:pPr>
+        <w:spacing w:after="40" w:before="100"/>
+      </w:pPr>
+      <w:r>
+        <w:rPr>
+          <w:rFonts w:ascii="Arial" w:cs="Arial" w:eastAsia="Arial" w:hAnsi="Arial"/>
+          <w:b/>
+          <w:bCs/>
+          <w:sz w:val="22"/>
+          <w:szCs w:val="22"/>
+        </w:rPr>
+        <w:t xml:space="preserve">Q. Why is payroll “N/A” for control testing?</w:t>
+      </w:r>
+    </w:p>
+    <w:p>
+      <w:pPr>
+        <w:spacing w:after="100"/>
+      </w:pPr>
+      <w:r>
+        <w:rPr>
+          <w:rFonts w:ascii="Arial" w:cs="Arial" w:eastAsia="Arial" w:hAnsi="Arial"/>
+          <w:sz w:val="22"/>
+          <w:szCs w:val="22"/>
+        </w:rPr>
+        <w:t xml:space="preserve">A. For payroll, we test the balances directly at year-end instead of relying on controls. The walkthrough is complete.</w:t>
+      </w:r>
+    </w:p>
+    <w:p>
+      <w:pPr>
+        <w:spacing w:after="40" w:before="100"/>
+      </w:pPr>
+      <w:r>
+        <w:rPr>
+          <w:rFonts w:ascii="Arial" w:cs="Arial" w:eastAsia="Arial" w:hAnsi="Arial"/>
+          <w:b/>
+          <w:bCs/>
+          <w:sz w:val="22"/>
+          <w:szCs w:val="22"/>
+        </w:rPr>
+        <w:t xml:space="preserve">Q. Why test December separately for the revenue reconciliation?</w:t>
+      </w:r>
+    </w:p>
+    <w:p>
+      <w:pPr>
+        <w:spacing w:after="100"/>
+      </w:pPr>
+      <w:r>
+        <w:rPr>
+          <w:rFonts w:ascii="Arial" w:cs="Arial" w:eastAsia="Arial" w:hAnsi="Arial"/>
+          <w:sz w:val="22"/>
+          <w:szCs w:val="22"/>
+        </w:rPr>
+        <w:t xml:space="preserve">A. December is after the interim period. We need to cover the full year, so we’ll test it at year-end.</w:t>
+      </w:r>
+    </w:p>
+    <w:p>
+      <w:pPr>
+        <w:spacing w:after="80" w:before="240"/>
+      </w:pPr>
+      <w:r>
+        <w:rPr>
+          <w:rFonts w:ascii="Arial" w:cs="Arial" w:eastAsia="Arial" w:hAnsi="Arial"/>
+          <w:b/>
+          <w:bCs/>
+          <w:color w:val="1F5FBF"/>
+          <w:sz w:val="24"/>
+          <w:szCs w:val="24"/>
+        </w:rPr>
+        <w:t xml:space="preserve">Restructuring – VRP (Slide 8)</w:t>
+      </w:r>
+    </w:p>
+    <w:p>
+      <w:pPr>
+        <w:spacing w:after="40" w:before="100"/>
+      </w:pPr>
+      <w:r>
+        <w:rPr>
+          <w:rFonts w:ascii="Arial" w:cs="Arial" w:eastAsia="Arial" w:hAnsi="Arial"/>
+          <w:b/>
+          <w:bCs/>
+          <w:sz w:val="22"/>
+          <w:szCs w:val="22"/>
+        </w:rPr>
+        <w:t xml:space="preserve">Q. Do we really need to reverse the 2.9 billion won?</w:t>
+      </w:r>
+    </w:p>
+    <w:p>
+      <w:pPr>
+        <w:spacing w:after="100"/>
+      </w:pPr>
+      <w:r>
+        <w:rPr>
+          <w:rFonts w:ascii="Arial" w:cs="Arial" w:eastAsia="Arial" w:hAnsi="Arial"/>
+          <w:sz w:val="22"/>
+          <w:szCs w:val="22"/>
+        </w:rPr>
+        <w:t xml:space="preserve">A. Only if there’s no plan to use it. If there’s a formal plan for those employees, please share it and we’ll review it.</w:t>
+      </w:r>
+    </w:p>
+    <w:p>
+      <w:pPr>
+        <w:spacing w:after="40" w:before="100"/>
+      </w:pPr>
+      <w:r>
+        <w:rPr>
+          <w:rFonts w:ascii="Arial" w:cs="Arial" w:eastAsia="Arial" w:hAnsi="Arial"/>
+          <w:b/>
+          <w:bCs/>
+          <w:sz w:val="22"/>
+          <w:szCs w:val="22"/>
+        </w:rPr>
+        <w:t xml:space="preserve">Q. Can we keep the provision for programs planned next year?</w:t>
+      </w:r>
+    </w:p>
+    <w:p>
+      <w:pPr>
+        <w:spacing w:after="100"/>
+      </w:pPr>
+      <w:r>
+        <w:rPr>
+          <w:rFonts w:ascii="Arial" w:cs="Arial" w:eastAsia="Arial" w:hAnsi="Arial"/>
+          <w:sz w:val="22"/>
+          <w:szCs w:val="22"/>
+        </w:rPr>
+        <w:t xml:space="preserve">A. No. A provision needs a formal, detailed plan that’s been announced by the balance sheet date. Future programs should be booked when they’re announced.</w:t>
+      </w:r>
+    </w:p>
+    <w:p>
+      <w:pPr>
+        <w:spacing w:after="40" w:before="100"/>
+      </w:pPr>
+      <w:r>
+        <w:rPr>
+          <w:rFonts w:ascii="Arial" w:cs="Arial" w:eastAsia="Arial" w:hAnsi="Arial"/>
+          <w:b/>
+          <w:bCs/>
+          <w:sz w:val="22"/>
+          <w:szCs w:val="22"/>
+        </w:rPr>
+        <w:t xml:space="preserve">Q. What evidence supports the 162 million won gap?</w:t>
+      </w:r>
+    </w:p>
+    <w:p>
+      <w:pPr>
+        <w:spacing w:after="100"/>
+      </w:pPr>
+      <w:r>
+        <w:rPr>
+          <w:rFonts w:ascii="Arial" w:cs="Arial" w:eastAsia="Arial" w:hAnsi="Arial"/>
+          <w:sz w:val="22"/>
+          <w:szCs w:val="22"/>
+        </w:rPr>
+        <w:t xml:space="preserve">A. A formal plan approved and communicated to the employees affected, or signed agreements. If we get that, the provision can stay.</w:t>
+      </w:r>
+    </w:p>
+    <w:p>
+      <w:pPr>
+        <w:spacing w:after="40" w:before="100"/>
+      </w:pPr>
+      <w:r>
+        <w:rPr>
+          <w:rFonts w:ascii="Arial" w:cs="Arial" w:eastAsia="Arial" w:hAnsi="Arial"/>
+          <w:b/>
+          <w:bCs/>
+          <w:sz w:val="22"/>
+          <w:szCs w:val="22"/>
+        </w:rPr>
+        <w:t xml:space="preserve">Q. What if an employee signs after year-end?</w:t>
+      </w:r>
+    </w:p>
+    <w:p>
+      <w:pPr>
+        <w:spacing w:after="100"/>
+      </w:pPr>
+      <w:r>
+        <w:rPr>
+          <w:rFonts w:ascii="Arial" w:cs="Arial" w:eastAsia="Arial" w:hAnsi="Arial"/>
+          <w:sz w:val="22"/>
+          <w:szCs w:val="22"/>
+        </w:rPr>
+        <w:t xml:space="preserve">A. If the plan was announced before year-end, the provision can be booked at year-end. If not, it goes into 2027.</w:t>
+      </w:r>
+    </w:p>
+    <w:p>
+      <w:pPr>
+        <w:spacing w:after="80" w:before="240"/>
+      </w:pPr>
+      <w:r>
+        <w:rPr>
+          <w:rFonts w:ascii="Arial" w:cs="Arial" w:eastAsia="Arial" w:hAnsi="Arial"/>
+          <w:b/>
+          <w:bCs/>
+          <w:color w:val="1F5FBF"/>
+          <w:sz w:val="24"/>
+          <w:szCs w:val="24"/>
+        </w:rPr>
+        <w:t xml:space="preserve">Banpo office lease (Slide 9)</w:t>
+      </w:r>
+    </w:p>
+    <w:p>
+      <w:pPr>
+        <w:spacing w:after="40" w:before="100"/>
+      </w:pPr>
+      <w:r>
+        <w:rPr>
+          <w:rFonts w:ascii="Arial" w:cs="Arial" w:eastAsia="Arial" w:hAnsi="Arial"/>
+          <w:b/>
+          <w:bCs/>
+          <w:sz w:val="22"/>
+          <w:szCs w:val="22"/>
+        </w:rPr>
+        <w:t xml:space="preserve">Q. From when should the new depreciation period apply?</w:t>
+      </w:r>
+    </w:p>
+    <w:p>
+      <w:pPr>
+        <w:spacing w:after="100"/>
+      </w:pPr>
+      <w:r>
+        <w:rPr>
+          <w:rFonts w:ascii="Arial" w:cs="Arial" w:eastAsia="Arial" w:hAnsi="Arial"/>
+          <w:sz w:val="22"/>
+          <w:szCs w:val="22"/>
+        </w:rPr>
+        <w:t xml:space="preserve">A. From the beginning of 2026, the same way the change was applied last year. It’s applied going forward, without restating prior years.</w:t>
+      </w:r>
+    </w:p>
+    <w:p>
+      <w:pPr>
+        <w:spacing w:after="40" w:before="100"/>
+      </w:pPr>
+      <w:r>
+        <w:rPr>
+          <w:rFonts w:ascii="Arial" w:cs="Arial" w:eastAsia="Arial" w:hAnsi="Arial"/>
+          <w:b/>
+          <w:bCs/>
+          <w:sz w:val="22"/>
+          <w:szCs w:val="22"/>
+        </w:rPr>
+        <w:t xml:space="preserve">Q. How big is the depreciation impact?</w:t>
+      </w:r>
+    </w:p>
+    <w:p>
+      <w:pPr>
+        <w:spacing w:after="100"/>
+      </w:pPr>
+      <w:r>
+        <w:rPr>
+          <w:rFonts w:ascii="Arial" w:cs="Arial" w:eastAsia="Arial" w:hAnsi="Arial"/>
+          <w:sz w:val="22"/>
+          <w:szCs w:val="22"/>
+        </w:rPr>
+        <w:t xml:space="preserve">A. Small. Depreciation booked to September is about 45 million won too high, and about 46 million won for the full year. That amount should be reversed.</w:t>
+      </w:r>
+    </w:p>
+    <w:p>
+      <w:pPr>
+        <w:spacing w:after="40" w:before="100"/>
+      </w:pPr>
+      <w:r>
+        <w:rPr>
+          <w:rFonts w:ascii="Arial" w:cs="Arial" w:eastAsia="Arial" w:hAnsi="Arial"/>
+          <w:b/>
+          <w:bCs/>
+          <w:sz w:val="22"/>
+          <w:szCs w:val="22"/>
+        </w:rPr>
+        <w:t xml:space="preserve">Q. Why remeasure the restoration provision if the amount hardly changes?</w:t>
+      </w:r>
+    </w:p>
+    <w:p>
+      <w:pPr>
+        <w:spacing w:after="100"/>
+      </w:pPr>
+      <w:r>
+        <w:rPr>
+          <w:rFonts w:ascii="Arial" w:cs="Arial" w:eastAsia="Arial" w:hAnsi="Arial"/>
+          <w:sz w:val="22"/>
+          <w:szCs w:val="22"/>
+        </w:rPr>
+        <w:t xml:space="preserve">A. Because both the cost estimate and the timing have changed. We just need the year-end figure to reflect the latest quote. The discounting effect is only about 9 million won.</w:t>
+      </w:r>
+    </w:p>
+    <w:p>
+      <w:pPr>
+        <w:spacing w:after="40" w:before="100"/>
+      </w:pPr>
+      <w:r>
+        <w:rPr>
+          <w:rFonts w:ascii="Arial" w:cs="Arial" w:eastAsia="Arial" w:hAnsi="Arial"/>
+          <w:b/>
+          <w:bCs/>
+          <w:sz w:val="22"/>
+          <w:szCs w:val="22"/>
+        </w:rPr>
+        <w:t xml:space="preserve">Q. Why move the deposit to current assets?</w:t>
+      </w:r>
+    </w:p>
+    <w:p>
+      <w:pPr>
+        <w:spacing w:after="100"/>
+      </w:pPr>
+      <w:r>
+        <w:rPr>
+          <w:rFonts w:ascii="Arial" w:cs="Arial" w:eastAsia="Arial" w:hAnsi="Arial"/>
+          <w:sz w:val="22"/>
+          <w:szCs w:val="22"/>
+        </w:rPr>
+        <w:t xml:space="preserve">A. The lease ends in May 2027, so the deposit will be returned within 12 months of year-end.</w:t>
+      </w:r>
+    </w:p>
+    <w:p>
+      <w:pPr>
+        <w:spacing w:after="80" w:before="240"/>
+      </w:pPr>
+      <w:r>
+        <w:rPr>
+          <w:rFonts w:ascii="Arial" w:cs="Arial" w:eastAsia="Arial" w:hAnsi="Arial"/>
+          <w:b/>
+          <w:bCs/>
+          <w:color w:val="1F5FBF"/>
+          <w:sz w:val="24"/>
+          <w:szCs w:val="24"/>
+        </w:rPr>
+        <w:t xml:space="preserve">Customs audit (Slide 10)</w:t>
+      </w:r>
+    </w:p>
+    <w:p>
+      <w:pPr>
+        <w:spacing w:after="40" w:before="100"/>
+      </w:pPr>
+      <w:r>
+        <w:rPr>
+          <w:rFonts w:ascii="Arial" w:cs="Arial" w:eastAsia="Arial" w:hAnsi="Arial"/>
+          <w:b/>
+          <w:bCs/>
+          <w:sz w:val="22"/>
+          <w:szCs w:val="22"/>
+        </w:rPr>
+        <w:t xml:space="preserve">Q. Why can’t the duty and penalties stay in income tax expense?</w:t>
+      </w:r>
+    </w:p>
+    <w:p>
+      <w:pPr>
+        <w:spacing w:after="100"/>
+      </w:pPr>
+      <w:r>
+        <w:rPr>
+          <w:rFonts w:ascii="Arial" w:cs="Arial" w:eastAsia="Arial" w:hAnsi="Arial"/>
+          <w:sz w:val="22"/>
+          <w:szCs w:val="22"/>
+        </w:rPr>
+        <w:t xml:space="preserve">A. Income tax expense is only for taxes based on taxable income. Customs duty and penalties aren’t, so they belong in SG&amp;A, under taxes and dues.</w:t>
+      </w:r>
+    </w:p>
+    <w:p>
+      <w:pPr>
+        <w:spacing w:after="40" w:before="100"/>
+      </w:pPr>
+      <w:r>
+        <w:rPr>
+          <w:rFonts w:ascii="Arial" w:cs="Arial" w:eastAsia="Arial" w:hAnsi="Arial"/>
+          <w:b/>
+          <w:bCs/>
+          <w:sz w:val="22"/>
+          <w:szCs w:val="22"/>
+        </w:rPr>
+        <w:t xml:space="preserve">Q. Does the reclassification change profit?</w:t>
+      </w:r>
+    </w:p>
+    <w:p>
+      <w:pPr>
+        <w:spacing w:after="100"/>
+      </w:pPr>
+      <w:r>
+        <w:rPr>
+          <w:rFonts w:ascii="Arial" w:cs="Arial" w:eastAsia="Arial" w:hAnsi="Arial"/>
+          <w:sz w:val="22"/>
+          <w:szCs w:val="22"/>
+        </w:rPr>
+        <w:t xml:space="preserve">A. It doesn’t change net income. It only moves 53 million won from income tax expense to SG&amp;A, so operating profit goes down slightly.</w:t>
+      </w:r>
+    </w:p>
+    <w:p>
+      <w:pPr>
+        <w:spacing w:after="40" w:before="100"/>
+      </w:pPr>
+      <w:r>
+        <w:rPr>
+          <w:rFonts w:ascii="Arial" w:cs="Arial" w:eastAsia="Arial" w:hAnsi="Arial"/>
+          <w:b/>
+          <w:bCs/>
+          <w:sz w:val="22"/>
+          <w:szCs w:val="22"/>
+        </w:rPr>
+        <w:t xml:space="preserve">Q. Could there be more assessments for the same period?</w:t>
+      </w:r>
+    </w:p>
+    <w:p>
+      <w:pPr>
+        <w:spacing w:after="100"/>
+      </w:pPr>
+      <w:r>
+        <w:rPr>
+          <w:rFonts w:ascii="Arial" w:cs="Arial" w:eastAsia="Arial" w:hAnsi="Arial"/>
+          <w:sz w:val="22"/>
+          <w:szCs w:val="22"/>
+        </w:rPr>
+        <w:t xml:space="preserve">A. The result is final for the period audited. We’ll check for any new notices at year-end.</w:t>
+      </w:r>
+    </w:p>
+    <w:p>
+      <w:pPr>
+        <w:spacing w:after="80" w:before="240"/>
+      </w:pPr>
+      <w:r>
+        <w:rPr>
+          <w:rFonts w:ascii="Arial" w:cs="Arial" w:eastAsia="Arial" w:hAnsi="Arial"/>
+          <w:b/>
+          <w:bCs/>
+          <w:color w:val="1F5FBF"/>
+          <w:sz w:val="24"/>
+          <w:szCs w:val="24"/>
+        </w:rPr>
+        <w:t xml:space="preserve">Taxotere (Slide 12)</w:t>
+      </w:r>
+    </w:p>
+    <w:p>
+      <w:pPr>
+        <w:spacing w:after="40" w:before="100"/>
       </w:pPr>
       <w:r>
         <w:rPr>
@@ -1630,7 +2358,7 @@
     </w:p>
     <w:p>
       <w:pPr>
-        <w:spacing w:after="120"/>
+        <w:spacing w:after="100"/>
       </w:pPr>
       <w:r>
         <w:rPr>
@@ -1643,22 +2371,658 @@
     </w:p>
     <w:p>
       <w:pPr>
-        <w:spacing w:after="60" w:before="120"/>
-      </w:pPr>
-      <w:r>
-        <w:rPr>
-          <w:rFonts w:ascii="Arial" w:cs="Arial" w:eastAsia="Arial" w:hAnsi="Arial"/>
-          <w:b/>
-          <w:bCs/>
-          <w:sz w:val="22"/>
-          <w:szCs w:val="22"/>
-        </w:rPr>
-        <w:t xml:space="preserve">Q. Why should SAK book the Action share cost if nobody charges it to us?</w:t>
-      </w:r>
-    </w:p>
-    <w:p>
-      <w:pPr>
-        <w:spacing w:after="120"/>
+        <w:spacing w:after="40" w:before="100"/>
+      </w:pPr>
+      <w:r>
+        <w:rPr>
+          <w:rFonts w:ascii="Arial" w:cs="Arial" w:eastAsia="Arial" w:hAnsi="Arial"/>
+          <w:b/>
+          <w:bCs/>
+          <w:sz w:val="22"/>
+          <w:szCs w:val="22"/>
+        </w:rPr>
+        <w:t xml:space="preserve">Q. Why was #1 non-operating if it was inventory?</w:t>
+      </w:r>
+    </w:p>
+    <w:p>
+      <w:pPr>
+        <w:spacing w:after="100"/>
+      </w:pPr>
+      <w:r>
+        <w:rPr>
+          <w:rFonts w:ascii="Arial" w:cs="Arial" w:eastAsia="Arial" w:hAnsi="Arial"/>
+          <w:sz w:val="22"/>
+          <w:szCs w:val="22"/>
+        </w:rPr>
+        <w:t xml:space="preserve">A. Because it was part of selling the whole business, together with the MA and trademark. The price was set by the group in the APA, and the stock didn’t move. It wasn’t a normal sale to a customer.</w:t>
+      </w:r>
+    </w:p>
+    <w:p>
+      <w:pPr>
+        <w:spacing w:after="40" w:before="100"/>
+      </w:pPr>
+      <w:r>
+        <w:rPr>
+          <w:rFonts w:ascii="Arial" w:cs="Arial" w:eastAsia="Arial" w:hAnsi="Arial"/>
+          <w:b/>
+          <w:bCs/>
+          <w:sz w:val="22"/>
+          <w:szCs w:val="22"/>
+        </w:rPr>
+        <w:t xml:space="preserve">Q. Does renaming the #1 account change anything?</w:t>
+      </w:r>
+    </w:p>
+    <w:p>
+      <w:pPr>
+        <w:spacing w:after="100"/>
+      </w:pPr>
+      <w:r>
+        <w:rPr>
+          <w:rFonts w:ascii="Arial" w:cs="Arial" w:eastAsia="Arial" w:hAnsi="Arial"/>
+          <w:sz w:val="22"/>
+          <w:szCs w:val="22"/>
+        </w:rPr>
+        <w:t xml:space="preserve">A. No. It’s only the account name. There’s no impact on profit.</w:t>
+      </w:r>
+    </w:p>
+    <w:p>
+      <w:pPr>
+        <w:spacing w:after="40" w:before="100"/>
+      </w:pPr>
+      <w:r>
+        <w:rPr>
+          <w:rFonts w:ascii="Arial" w:cs="Arial" w:eastAsia="Arial" w:hAnsi="Arial"/>
+          <w:b/>
+          <w:bCs/>
+          <w:sz w:val="22"/>
+          <w:szCs w:val="22"/>
+        </w:rPr>
+        <w:t xml:space="preserve">Q. Why record #3 gross, when the margin is basically fixed?</w:t>
+      </w:r>
+    </w:p>
+    <w:p>
+      <w:pPr>
+        <w:spacing w:after="100"/>
+      </w:pPr>
+      <w:r>
+        <w:rPr>
+          <w:rFonts w:ascii="Arial" w:cs="Arial" w:eastAsia="Arial" w:hAnsi="Arial"/>
+          <w:sz w:val="22"/>
+          <w:szCs w:val="22"/>
+        </w:rPr>
+        <w:t xml:space="preserve">A. SAK sells in its own name, invoices and collects from wholesalers, and takes the credit and inventory risk. So SAK is the principal, and gross revenue is appropriate.</w:t>
+      </w:r>
+    </w:p>
+    <w:p>
+      <w:pPr>
+        <w:spacing w:after="40" w:before="100"/>
+      </w:pPr>
+      <w:r>
+        <w:rPr>
+          <w:rFonts w:ascii="Arial" w:cs="Arial" w:eastAsia="Arial" w:hAnsi="Arial"/>
+          <w:b/>
+          <w:bCs/>
+          <w:sz w:val="22"/>
+          <w:szCs w:val="22"/>
+        </w:rPr>
+        <w:t xml:space="preserve">Q. Who settles the TDA credit of about 370 to 400 million won?</w:t>
+      </w:r>
+    </w:p>
+    <w:p>
+      <w:pPr>
+        <w:spacing w:after="100"/>
+      </w:pPr>
+      <w:r>
+        <w:rPr>
+          <w:rFonts w:ascii="Arial" w:cs="Arial" w:eastAsia="Arial" w:hAnsi="Arial"/>
+          <w:sz w:val="22"/>
+          <w:szCs w:val="22"/>
+        </w:rPr>
+        <w:t xml:space="preserve">A. SWI and Boryung settle it centrally. HQ confirmed this, so SAK doesn’t need to book anything.</w:t>
+      </w:r>
+    </w:p>
+    <w:p>
+      <w:pPr>
+        <w:spacing w:after="40" w:before="100"/>
+      </w:pPr>
+      <w:r>
+        <w:rPr>
+          <w:rFonts w:ascii="Arial" w:cs="Arial" w:eastAsia="Arial" w:hAnsi="Arial"/>
+          <w:b/>
+          <w:bCs/>
+          <w:sz w:val="22"/>
+          <w:szCs w:val="22"/>
+        </w:rPr>
+        <w:t xml:space="preserve">Q. How will the #5 amount be calculated?</w:t>
+      </w:r>
+    </w:p>
+    <w:p>
+      <w:pPr>
+        <w:spacing w:after="100"/>
+      </w:pPr>
+      <w:r>
+        <w:rPr>
+          <w:rFonts w:ascii="Arial" w:cs="Arial" w:eastAsia="Arial" w:hAnsi="Arial"/>
+          <w:sz w:val="22"/>
+          <w:szCs w:val="22"/>
+        </w:rPr>
+        <w:t xml:space="preserve">A. The quantities on the invoice times the TDA provisional price — 48.52 euros for 20 mg and 155.44 euros for 80 mg — converted at the group’s monthly average rate for October.</w:t>
+      </w:r>
+    </w:p>
+    <w:p>
+      <w:pPr>
+        <w:spacing w:after="40" w:before="100"/>
+      </w:pPr>
+      <w:r>
+        <w:rPr>
+          <w:rFonts w:ascii="Arial" w:cs="Arial" w:eastAsia="Arial" w:hAnsi="Arial"/>
+          <w:b/>
+          <w:bCs/>
+          <w:sz w:val="22"/>
+          <w:szCs w:val="22"/>
+        </w:rPr>
+        <w:t xml:space="preserve">Q. Will the TDA price for #5 be adjusted later?</w:t>
+      </w:r>
+    </w:p>
+    <w:p>
+      <w:pPr>
+        <w:spacing w:after="100"/>
+      </w:pPr>
+      <w:r>
+        <w:rPr>
+          <w:rFonts w:ascii="Arial" w:cs="Arial" w:eastAsia="Arial" w:hAnsi="Arial"/>
+          <w:sz w:val="22"/>
+          <w:szCs w:val="22"/>
+        </w:rPr>
+        <w:t xml:space="preserve">A. We don’t expect so. The TDA adjusts the price only for sales to customers, and this is a repurchase by Boryung. We’ll check the final settlement terms at year-end.</w:t>
+      </w:r>
+    </w:p>
+    <w:p>
+      <w:pPr>
+        <w:spacing w:after="40" w:before="100"/>
+      </w:pPr>
+      <w:r>
+        <w:rPr>
+          <w:rFonts w:ascii="Arial" w:cs="Arial" w:eastAsia="Arial" w:hAnsi="Arial"/>
+          <w:b/>
+          <w:bCs/>
+          <w:sz w:val="22"/>
+          <w:szCs w:val="22"/>
+        </w:rPr>
+        <w:t xml:space="preserve">Q. SAK has a loss on #1 and a gain on #5. Will the group adjust this?</w:t>
+      </w:r>
+    </w:p>
+    <w:p>
+      <w:pPr>
+        <w:spacing w:after="100"/>
+      </w:pPr>
+      <w:r>
+        <w:rPr>
+          <w:rFonts w:ascii="Arial" w:cs="Arial" w:eastAsia="Arial" w:hAnsi="Arial"/>
+          <w:sz w:val="22"/>
+          <w:szCs w:val="22"/>
+        </w:rPr>
+        <w:t xml:space="preserve">A. That’s what we’d like to confirm. If there’s a year-end transfer pricing adjustment that covers Taxotere, we need to know so it’s booked correctly.</w:t>
+      </w:r>
+    </w:p>
+    <w:p>
+      <w:pPr>
+        <w:spacing w:after="40" w:before="100"/>
+      </w:pPr>
+      <w:r>
+        <w:rPr>
+          <w:rFonts w:ascii="Arial" w:cs="Arial" w:eastAsia="Arial" w:hAnsi="Arial"/>
+          <w:b/>
+          <w:bCs/>
+          <w:sz w:val="22"/>
+          <w:szCs w:val="22"/>
+        </w:rPr>
+        <w:t xml:space="preserve">Q. What about FX differences on the Boryung receivable?</w:t>
+      </w:r>
+    </w:p>
+    <w:p>
+      <w:pPr>
+        <w:spacing w:after="100"/>
+      </w:pPr>
+      <w:r>
+        <w:rPr>
+          <w:rFonts w:ascii="Arial" w:cs="Arial" w:eastAsia="Arial" w:hAnsi="Arial"/>
+          <w:sz w:val="22"/>
+          <w:szCs w:val="22"/>
+        </w:rPr>
+        <w:t xml:space="preserve">A. Any difference between the invoice rate and the payment rate is an FX gain or loss, in non-operating items.</w:t>
+      </w:r>
+    </w:p>
+    <w:p>
+      <w:pPr>
+        <w:spacing w:after="40" w:before="100"/>
+      </w:pPr>
+      <w:r>
+        <w:rPr>
+          <w:rFonts w:ascii="Arial" w:cs="Arial" w:eastAsia="Arial" w:hAnsi="Arial"/>
+          <w:b/>
+          <w:bCs/>
+          <w:sz w:val="22"/>
+          <w:szCs w:val="22"/>
+        </w:rPr>
+        <w:t xml:space="preserve">Q. When will #5 be booked?</w:t>
+      </w:r>
+    </w:p>
+    <w:p>
+      <w:pPr>
+        <w:spacing w:after="100"/>
+      </w:pPr>
+      <w:r>
+        <w:rPr>
+          <w:rFonts w:ascii="Arial" w:cs="Arial" w:eastAsia="Arial" w:hAnsi="Arial"/>
+          <w:sz w:val="22"/>
+          <w:szCs w:val="22"/>
+        </w:rPr>
+        <w:t xml:space="preserve">A. In October, so it’ll be in the Q4 numbers. We’ll test it at year-end with the invoice and delivery documents.</w:t>
+      </w:r>
+    </w:p>
+    <w:p>
+      <w:pPr>
+        <w:spacing w:after="80" w:before="240"/>
+      </w:pPr>
+      <w:r>
+        <w:rPr>
+          <w:rFonts w:ascii="Arial" w:cs="Arial" w:eastAsia="Arial" w:hAnsi="Arial"/>
+          <w:b/>
+          <w:bCs/>
+          <w:color w:val="1F5FBF"/>
+          <w:sz w:val="24"/>
+          <w:szCs w:val="24"/>
+        </w:rPr>
+        <w:t xml:space="preserve">Caprelsa and Rodogyl (Slide 13)</w:t>
+      </w:r>
+    </w:p>
+    <w:p>
+      <w:pPr>
+        <w:spacing w:after="40" w:before="100"/>
+      </w:pPr>
+      <w:r>
+        <w:rPr>
+          <w:rFonts w:ascii="Arial" w:cs="Arial" w:eastAsia="Arial" w:hAnsi="Arial"/>
+          <w:b/>
+          <w:bCs/>
+          <w:sz w:val="22"/>
+          <w:szCs w:val="22"/>
+        </w:rPr>
+        <w:t xml:space="preserve">Q. Why do you need the Caprelsa documents now?</w:t>
+      </w:r>
+    </w:p>
+    <w:p>
+      <w:pPr>
+        <w:spacing w:after="100"/>
+      </w:pPr>
+      <w:r>
+        <w:rPr>
+          <w:rFonts w:ascii="Arial" w:cs="Arial" w:eastAsia="Arial" w:hAnsi="Arial"/>
+          <w:sz w:val="22"/>
+          <w:szCs w:val="22"/>
+        </w:rPr>
+        <w:t xml:space="preserve">A. So we can plan for the MA transfer in April 2027. We also need to see whether anything should be disclosed at year-end.</w:t>
+      </w:r>
+    </w:p>
+    <w:p>
+      <w:pPr>
+        <w:spacing w:after="40" w:before="100"/>
+      </w:pPr>
+      <w:r>
+        <w:rPr>
+          <w:rFonts w:ascii="Arial" w:cs="Arial" w:eastAsia="Arial" w:hAnsi="Arial"/>
+          <w:b/>
+          <w:bCs/>
+          <w:sz w:val="22"/>
+          <w:szCs w:val="22"/>
+        </w:rPr>
+        <w:t xml:space="preserve">Q. Do we need to disclose the Caprelsa divestment at year-end?</w:t>
+      </w:r>
+    </w:p>
+    <w:p>
+      <w:pPr>
+        <w:spacing w:after="100"/>
+      </w:pPr>
+      <w:r>
+        <w:rPr>
+          <w:rFonts w:ascii="Arial" w:cs="Arial" w:eastAsia="Arial" w:hAnsi="Arial"/>
+          <w:sz w:val="22"/>
+          <w:szCs w:val="22"/>
+        </w:rPr>
+        <w:t xml:space="preserve">A. Possibly, depending on what’s been signed by then. We’ll decide once we see the documents.</w:t>
+      </w:r>
+    </w:p>
+    <w:p>
+      <w:pPr>
+        <w:spacing w:after="40" w:before="100"/>
+      </w:pPr>
+      <w:r>
+        <w:rPr>
+          <w:rFonts w:ascii="Arial" w:cs="Arial" w:eastAsia="Arial" w:hAnsi="Arial"/>
+          <w:b/>
+          <w:bCs/>
+          <w:sz w:val="22"/>
+          <w:szCs w:val="22"/>
+        </w:rPr>
+        <w:t xml:space="preserve">Q. Should the Caprelsa inventory be written down?</w:t>
+      </w:r>
+    </w:p>
+    <w:p>
+      <w:pPr>
+        <w:spacing w:after="100"/>
+      </w:pPr>
+      <w:r>
+        <w:rPr>
+          <w:rFonts w:ascii="Arial" w:cs="Arial" w:eastAsia="Arial" w:hAnsi="Arial"/>
+          <w:sz w:val="22"/>
+          <w:szCs w:val="22"/>
+        </w:rPr>
+        <w:t xml:space="preserve">A. Only if it can’t be sold for more than its cost. We’ll check that at year-end, including the expected transfer price.</w:t>
+      </w:r>
+    </w:p>
+    <w:p>
+      <w:pPr>
+        <w:spacing w:after="40" w:before="100"/>
+      </w:pPr>
+      <w:r>
+        <w:rPr>
+          <w:rFonts w:ascii="Arial" w:cs="Arial" w:eastAsia="Arial" w:hAnsi="Arial"/>
+          <w:b/>
+          <w:bCs/>
+          <w:sz w:val="22"/>
+          <w:szCs w:val="22"/>
+        </w:rPr>
+        <w:t xml:space="preserve">Q. When the Rodogyl stock is destroyed, how do we record it?</w:t>
+      </w:r>
+    </w:p>
+    <w:p>
+      <w:pPr>
+        <w:spacing w:after="100"/>
+      </w:pPr>
+      <w:r>
+        <w:rPr>
+          <w:rFonts w:ascii="Arial" w:cs="Arial" w:eastAsia="Arial" w:hAnsi="Arial"/>
+          <w:sz w:val="22"/>
+          <w:szCs w:val="22"/>
+        </w:rPr>
+        <w:t xml:space="preserve">A. Write it off against the allowance. Since it’s already 100% provided for, there’s no extra P&amp;L impact.</w:t>
+      </w:r>
+    </w:p>
+    <w:p>
+      <w:pPr>
+        <w:spacing w:after="40" w:before="100"/>
+      </w:pPr>
+      <w:r>
+        <w:rPr>
+          <w:rFonts w:ascii="Arial" w:cs="Arial" w:eastAsia="Arial" w:hAnsi="Arial"/>
+          <w:b/>
+          <w:bCs/>
+          <w:sz w:val="22"/>
+          <w:szCs w:val="22"/>
+        </w:rPr>
+        <w:t xml:space="preserve">Q. How did you estimate future Rodogyl returns?</w:t>
+      </w:r>
+    </w:p>
+    <w:p>
+      <w:pPr>
+        <w:spacing w:after="100"/>
+      </w:pPr>
+      <w:r>
+        <w:rPr>
+          <w:rFonts w:ascii="Arial" w:cs="Arial" w:eastAsia="Arial" w:hAnsi="Arial"/>
+          <w:sz w:val="22"/>
+          <w:szCs w:val="22"/>
+        </w:rPr>
+        <w:t xml:space="preserve">A. From this year’s trend — about 1,800 units a month at about 2,300 won each. Even over 12 months, it’s under 50 million won.</w:t>
+      </w:r>
+    </w:p>
+    <w:p>
+      <w:pPr>
+        <w:spacing w:after="80" w:before="240"/>
+      </w:pPr>
+      <w:r>
+        <w:rPr>
+          <w:rFonts w:ascii="Arial" w:cs="Arial" w:eastAsia="Arial" w:hAnsi="Arial"/>
+          <w:b/>
+          <w:bCs/>
+          <w:color w:val="1F5FBF"/>
+          <w:sz w:val="24"/>
+          <w:szCs w:val="24"/>
+        </w:rPr>
+        <w:t xml:space="preserve">New office lease (Slide 14)</w:t>
+      </w:r>
+    </w:p>
+    <w:p>
+      <w:pPr>
+        <w:spacing w:after="40" w:before="100"/>
+      </w:pPr>
+      <w:r>
+        <w:rPr>
+          <w:rFonts w:ascii="Arial" w:cs="Arial" w:eastAsia="Arial" w:hAnsi="Arial"/>
+          <w:b/>
+          <w:bCs/>
+          <w:sz w:val="22"/>
+          <w:szCs w:val="22"/>
+        </w:rPr>
+        <w:t xml:space="preserve">Q. Do we need to put the new lease on the balance sheet?</w:t>
+      </w:r>
+    </w:p>
+    <w:p>
+      <w:pPr>
+        <w:spacing w:after="100"/>
+      </w:pPr>
+      <w:r>
+        <w:rPr>
+          <w:rFonts w:ascii="Arial" w:cs="Arial" w:eastAsia="Arial" w:hAnsi="Arial"/>
+          <w:sz w:val="22"/>
+          <w:szCs w:val="22"/>
+        </w:rPr>
+        <w:t xml:space="preserve">A. No. Under K-GAAP, it’s an operating lease. Rent is expensed, and the future payments are disclosed in the notes.</w:t>
+      </w:r>
+    </w:p>
+    <w:p>
+      <w:pPr>
+        <w:spacing w:after="40" w:before="100"/>
+      </w:pPr>
+      <w:r>
+        <w:rPr>
+          <w:rFonts w:ascii="Arial" w:cs="Arial" w:eastAsia="Arial" w:hAnsi="Arial"/>
+          <w:b/>
+          <w:bCs/>
+          <w:sz w:val="22"/>
+          <w:szCs w:val="22"/>
+        </w:rPr>
+        <w:t xml:space="preserve">Q. When does the rent expense start?</w:t>
+      </w:r>
+    </w:p>
+    <w:p>
+      <w:pPr>
+        <w:spacing w:after="100"/>
+      </w:pPr>
+      <w:r>
+        <w:rPr>
+          <w:rFonts w:ascii="Arial" w:cs="Arial" w:eastAsia="Arial" w:hAnsi="Arial"/>
+          <w:sz w:val="22"/>
+          <w:szCs w:val="22"/>
+        </w:rPr>
+        <w:t xml:space="preserve">A. From December 16, 2026, when the lease starts, even though you move in later.</w:t>
+      </w:r>
+    </w:p>
+    <w:p>
+      <w:pPr>
+        <w:spacing w:after="40" w:before="100"/>
+      </w:pPr>
+      <w:r>
+        <w:rPr>
+          <w:rFonts w:ascii="Arial" w:cs="Arial" w:eastAsia="Arial" w:hAnsi="Arial"/>
+          <w:b/>
+          <w:bCs/>
+          <w:sz w:val="22"/>
+          <w:szCs w:val="22"/>
+        </w:rPr>
+        <w:t xml:space="preserve">Q. Does the 3% minimum increase affect how rent is expensed?</w:t>
+      </w:r>
+    </w:p>
+    <w:p>
+      <w:pPr>
+        <w:spacing w:after="100"/>
+      </w:pPr>
+      <w:r>
+        <w:rPr>
+          <w:rFonts w:ascii="Arial" w:cs="Arial" w:eastAsia="Arial" w:hAnsi="Arial"/>
+          <w:sz w:val="22"/>
+          <w:szCs w:val="22"/>
+        </w:rPr>
+        <w:t xml:space="preserve">A. In principle, a fixed minimum increase is spread evenly over the lease term. We’ll look at the amount at year-end and discuss it with you.</w:t>
+      </w:r>
+    </w:p>
+    <w:p>
+      <w:pPr>
+        <w:spacing w:after="40" w:before="100"/>
+      </w:pPr>
+      <w:r>
+        <w:rPr>
+          <w:rFonts w:ascii="Arial" w:cs="Arial" w:eastAsia="Arial" w:hAnsi="Arial"/>
+          <w:b/>
+          <w:bCs/>
+          <w:sz w:val="22"/>
+          <w:szCs w:val="22"/>
+        </w:rPr>
+        <w:t xml:space="preserve">Q. Which fit-out costs can be capitalised?</w:t>
+      </w:r>
+    </w:p>
+    <w:p>
+      <w:pPr>
+        <w:spacing w:after="100"/>
+      </w:pPr>
+      <w:r>
+        <w:rPr>
+          <w:rFonts w:ascii="Arial" w:cs="Arial" w:eastAsia="Arial" w:hAnsi="Arial"/>
+          <w:sz w:val="22"/>
+          <w:szCs w:val="22"/>
+        </w:rPr>
+        <w:t xml:space="preserve">A. Costs needed to make the office ready to use — interior construction, electrical, air conditioning, IT cabling, and related design fees. Moving costs, opening events and rent during the works are expensed.</w:t>
+      </w:r>
+    </w:p>
+    <w:p>
+      <w:pPr>
+        <w:spacing w:after="40" w:before="100"/>
+      </w:pPr>
+      <w:r>
+        <w:rPr>
+          <w:rFonts w:ascii="Arial" w:cs="Arial" w:eastAsia="Arial" w:hAnsi="Arial"/>
+          <w:b/>
+          <w:bCs/>
+          <w:sz w:val="22"/>
+          <w:szCs w:val="22"/>
+        </w:rPr>
+        <w:t xml:space="preserve">Q. When do we start depreciating the leasehold improvements?</w:t>
+      </w:r>
+    </w:p>
+    <w:p>
+      <w:pPr>
+        <w:spacing w:after="100"/>
+      </w:pPr>
+      <w:r>
+        <w:rPr>
+          <w:rFonts w:ascii="Arial" w:cs="Arial" w:eastAsia="Arial" w:hAnsi="Arial"/>
+          <w:sz w:val="22"/>
+          <w:szCs w:val="22"/>
+        </w:rPr>
+        <w:t xml:space="preserve">A. From the date the office is ready to use, over the shorter of the useful life and the lease term, which ends in December 2033.</w:t>
+      </w:r>
+    </w:p>
+    <w:p>
+      <w:pPr>
+        <w:spacing w:after="40" w:before="100"/>
+      </w:pPr>
+      <w:r>
+        <w:rPr>
+          <w:rFonts w:ascii="Arial" w:cs="Arial" w:eastAsia="Arial" w:hAnsi="Arial"/>
+          <w:b/>
+          <w:bCs/>
+          <w:sz w:val="22"/>
+          <w:szCs w:val="22"/>
+        </w:rPr>
+        <w:t xml:space="preserve">Q. How is the new restoration provision measured?</w:t>
+      </w:r>
+    </w:p>
+    <w:p>
+      <w:pPr>
+        <w:spacing w:after="100"/>
+      </w:pPr>
+      <w:r>
+        <w:rPr>
+          <w:rFonts w:ascii="Arial" w:cs="Arial" w:eastAsia="Arial" w:hAnsi="Arial"/>
+          <w:sz w:val="22"/>
+          <w:szCs w:val="22"/>
+        </w:rPr>
+        <w:t xml:space="preserve">A. The estimated cost to restore the office at the end of the lease, discounted to today. The same amount is added to the asset cost.</w:t>
+      </w:r>
+    </w:p>
+    <w:p>
+      <w:pPr>
+        <w:spacing w:after="40" w:before="100"/>
+      </w:pPr>
+      <w:r>
+        <w:rPr>
+          <w:rFonts w:ascii="Arial" w:cs="Arial" w:eastAsia="Arial" w:hAnsi="Arial"/>
+          <w:b/>
+          <w:bCs/>
+          <w:sz w:val="22"/>
+          <w:szCs w:val="22"/>
+        </w:rPr>
+        <w:t xml:space="preserve">Q. What about the landlord paying part of the works, if that happens?</w:t>
+      </w:r>
+    </w:p>
+    <w:p>
+      <w:pPr>
+        <w:spacing w:after="100"/>
+      </w:pPr>
+      <w:r>
+        <w:rPr>
+          <w:rFonts w:ascii="Arial" w:cs="Arial" w:eastAsia="Arial" w:hAnsi="Arial"/>
+          <w:sz w:val="22"/>
+          <w:szCs w:val="22"/>
+        </w:rPr>
+        <w:t xml:space="preserve">A. That would be a lease incentive. It reduces rent expense over the lease term, rather than the asset cost.</w:t>
+      </w:r>
+    </w:p>
+    <w:p>
+      <w:pPr>
+        <w:spacing w:after="80" w:before="240"/>
+      </w:pPr>
+      <w:r>
+        <w:rPr>
+          <w:rFonts w:ascii="Arial" w:cs="Arial" w:eastAsia="Arial" w:hAnsi="Arial"/>
+          <w:b/>
+          <w:bCs/>
+          <w:color w:val="1F5FBF"/>
+          <w:sz w:val="24"/>
+          <w:szCs w:val="24"/>
+        </w:rPr>
+        <w:t xml:space="preserve">Action share (Slide 14)</w:t>
+      </w:r>
+    </w:p>
+    <w:p>
+      <w:pPr>
+        <w:spacing w:after="40" w:before="100"/>
+      </w:pPr>
+      <w:r>
+        <w:rPr>
+          <w:rFonts w:ascii="Arial" w:cs="Arial" w:eastAsia="Arial" w:hAnsi="Arial"/>
+          <w:b/>
+          <w:bCs/>
+          <w:sz w:val="22"/>
+          <w:szCs w:val="22"/>
+        </w:rPr>
+        <w:t xml:space="preserve">Q. Why should SAK book the cost if nobody charges it to us?</w:t>
+      </w:r>
+    </w:p>
+    <w:p>
+      <w:pPr>
+        <w:spacing w:after="100"/>
       </w:pPr>
       <w:r>
         <w:rPr>
@@ -1671,58 +3035,170 @@
     </w:p>
     <w:p>
       <w:pPr>
-        <w:spacing w:after="60" w:before="120"/>
-      </w:pPr>
-      <w:r>
-        <w:rPr>
-          <w:rFonts w:ascii="Arial" w:cs="Arial" w:eastAsia="Arial" w:hAnsi="Arial"/>
-          <w:b/>
-          <w:bCs/>
-          <w:sz w:val="22"/>
-          <w:szCs w:val="22"/>
-        </w:rPr>
-        <w:t xml:space="preserve">Q. Do we really need to reverse the 2.9 billion won?</w:t>
-      </w:r>
-    </w:p>
-    <w:p>
-      <w:pPr>
-        <w:spacing w:after="120"/>
-      </w:pPr>
-      <w:r>
-        <w:rPr>
-          <w:rFonts w:ascii="Arial" w:cs="Arial" w:eastAsia="Arial" w:hAnsi="Arial"/>
-          <w:sz w:val="22"/>
-          <w:szCs w:val="22"/>
-        </w:rPr>
-        <w:t xml:space="preserve">A. Only if there’s no plan to use it. If there’s a formal plan for those employees, please share it and we’ll review it.</w:t>
-      </w:r>
-    </w:p>
-    <w:p>
-      <w:pPr>
-        <w:spacing w:after="60" w:before="120"/>
-      </w:pPr>
-      <w:r>
-        <w:rPr>
-          <w:rFonts w:ascii="Arial" w:cs="Arial" w:eastAsia="Arial" w:hAnsi="Arial"/>
-          <w:b/>
-          <w:bCs/>
-          <w:sz w:val="22"/>
-          <w:szCs w:val="22"/>
-        </w:rPr>
-        <w:t xml:space="preserve">Q. Is the Banpo depreciation change a big number?</w:t>
-      </w:r>
-    </w:p>
-    <w:p>
-      <w:pPr>
-        <w:spacing w:after="120"/>
-      </w:pPr>
-      <w:r>
-        <w:rPr>
-          <w:rFonts w:ascii="Arial" w:cs="Arial" w:eastAsia="Arial" w:hAnsi="Arial"/>
-          <w:sz w:val="22"/>
-          <w:szCs w:val="22"/>
-        </w:rPr>
-        <w:t xml:space="preserve">A. Not really. The asset is mostly depreciated already, so the change mainly moves a small amount into next year.</w:t>
+        <w:spacing w:after="40" w:before="100"/>
+      </w:pPr>
+      <w:r>
+        <w:rPr>
+          <w:rFonts w:ascii="Arial" w:cs="Arial" w:eastAsia="Arial" w:hAnsi="Arial"/>
+          <w:b/>
+          <w:bCs/>
+          <w:sz w:val="22"/>
+          <w:szCs w:val="22"/>
+        </w:rPr>
+        <w:t xml:space="preserve">Q. Which accounts do we use?</w:t>
+      </w:r>
+    </w:p>
+    <w:p>
+      <w:pPr>
+        <w:spacing w:after="100"/>
+      </w:pPr>
+      <w:r>
+        <w:rPr>
+          <w:rFonts w:ascii="Arial" w:cs="Arial" w:eastAsia="Arial" w:hAnsi="Arial"/>
+          <w:sz w:val="22"/>
+          <w:szCs w:val="22"/>
+        </w:rPr>
+        <w:t xml:space="preserve">A. Debit an employee benefit expense in SG&amp;A, and credit capital surplus.</w:t>
+      </w:r>
+    </w:p>
+    <w:p>
+      <w:pPr>
+        <w:spacing w:after="40" w:before="100"/>
+      </w:pPr>
+      <w:r>
+        <w:rPr>
+          <w:rFonts w:ascii="Arial" w:cs="Arial" w:eastAsia="Arial" w:hAnsi="Arial"/>
+          <w:b/>
+          <w:bCs/>
+          <w:sz w:val="22"/>
+          <w:szCs w:val="22"/>
+        </w:rPr>
+        <w:t xml:space="preserve">Q. Is it tax deductible?</w:t>
+      </w:r>
+    </w:p>
+    <w:p>
+      <w:pPr>
+        <w:spacing w:after="100"/>
+      </w:pPr>
+      <w:r>
+        <w:rPr>
+          <w:rFonts w:ascii="Arial" w:cs="Arial" w:eastAsia="Arial" w:hAnsi="Arial"/>
+          <w:sz w:val="22"/>
+          <w:szCs w:val="22"/>
+        </w:rPr>
+        <w:t xml:space="preserve">A. We understand it isn’t, since SAK doesn’t actually pay the cost. Please confirm with your tax adviser.</w:t>
+      </w:r>
+    </w:p>
+    <w:p>
+      <w:pPr>
+        <w:spacing w:after="40" w:before="100"/>
+      </w:pPr>
+      <w:r>
+        <w:rPr>
+          <w:rFonts w:ascii="Arial" w:cs="Arial" w:eastAsia="Arial" w:hAnsi="Arial"/>
+          <w:b/>
+          <w:bCs/>
+          <w:sz w:val="22"/>
+          <w:szCs w:val="22"/>
+        </w:rPr>
+        <w:t xml:space="preserve">Q. Do we need to restate prior years?</w:t>
+      </w:r>
+    </w:p>
+    <w:p>
+      <w:pPr>
+        <w:spacing w:after="100"/>
+      </w:pPr>
+      <w:r>
+        <w:rPr>
+          <w:rFonts w:ascii="Arial" w:cs="Arial" w:eastAsia="Arial" w:hAnsi="Arial"/>
+          <w:sz w:val="22"/>
+          <w:szCs w:val="22"/>
+        </w:rPr>
+        <w:t xml:space="preserve">A. Probably not. The prior-year amounts are below materiality, so they can be booked this year as a prior-period adjustment. We’ll confirm once we have the group’s figures.</w:t>
+      </w:r>
+    </w:p>
+    <w:p>
+      <w:pPr>
+        <w:spacing w:after="40" w:before="100"/>
+      </w:pPr>
+      <w:r>
+        <w:rPr>
+          <w:rFonts w:ascii="Arial" w:cs="Arial" w:eastAsia="Arial" w:hAnsi="Arial"/>
+          <w:b/>
+          <w:bCs/>
+          <w:sz w:val="22"/>
+          <w:szCs w:val="22"/>
+        </w:rPr>
+        <w:t xml:space="preserve">Q. Why did you look at 2024 onwards only?</w:t>
+      </w:r>
+    </w:p>
+    <w:p>
+      <w:pPr>
+        <w:spacing w:after="100"/>
+      </w:pPr>
+      <w:r>
+        <w:rPr>
+          <w:rFonts w:ascii="Arial" w:cs="Arial" w:eastAsia="Arial" w:hAnsi="Arial"/>
+          <w:sz w:val="22"/>
+          <w:szCs w:val="22"/>
+        </w:rPr>
+        <w:t xml:space="preserve">A. We became your auditor from 2024, and the detailed data is available from then. The group’s policy will help us decide whether earlier years matter.</w:t>
+      </w:r>
+    </w:p>
+    <w:p>
+      <w:pPr>
+        <w:spacing w:after="40" w:before="100"/>
+      </w:pPr>
+      <w:r>
+        <w:rPr>
+          <w:rFonts w:ascii="Arial" w:cs="Arial" w:eastAsia="Arial" w:hAnsi="Arial"/>
+          <w:b/>
+          <w:bCs/>
+          <w:sz w:val="22"/>
+          <w:szCs w:val="22"/>
+        </w:rPr>
+        <w:t xml:space="preserve">Q. How did you estimate the amounts?</w:t>
+      </w:r>
+    </w:p>
+    <w:p>
+      <w:pPr>
+        <w:spacing w:after="100"/>
+      </w:pPr>
+      <w:r>
+        <w:rPr>
+          <w:rFonts w:ascii="Arial" w:cs="Arial" w:eastAsia="Arial" w:hAnsi="Arial"/>
+          <w:sz w:val="22"/>
+          <w:szCs w:val="22"/>
+        </w:rPr>
+        <w:t xml:space="preserve">A. We used the unit values in the group’s annual report — the discount and the free shares per share — and applied them to the shares bought by SAK employees. For 2026, we used the 2025 ratio.</w:t>
+      </w:r>
+    </w:p>
+    <w:p>
+      <w:pPr>
+        <w:spacing w:after="40" w:before="100"/>
+      </w:pPr>
+      <w:r>
+        <w:rPr>
+          <w:rFonts w:ascii="Arial" w:cs="Arial" w:eastAsia="Arial" w:hAnsi="Arial"/>
+          <w:b/>
+          <w:bCs/>
+          <w:sz w:val="22"/>
+          <w:szCs w:val="22"/>
+        </w:rPr>
+        <w:t xml:space="preserve">Q. Does this happen every year?</w:t>
+      </w:r>
+    </w:p>
+    <w:p>
+      <w:pPr>
+        <w:spacing w:after="100"/>
+      </w:pPr>
+      <w:r>
+        <w:rPr>
+          <w:rFonts w:ascii="Arial" w:cs="Arial" w:eastAsia="Arial" w:hAnsi="Arial"/>
+          <w:sz w:val="22"/>
+          <w:szCs w:val="22"/>
+        </w:rPr>
+        <w:t xml:space="preserve">A. Yes. Each year there’s a subscription, the cost should be booked on the subscription date.</w:t>
       </w:r>
     </w:p>
     <w:sectPr>

</xml_diff>